<commit_message>
Aggiunto Codice in Maude
creazione del primo file di codice scritto in Maude con una prima e grezza rappresentazione degli elementi del progetto, dichiarazione delle operazioni senza aver ancora implementato le equazioni.
</commit_message>
<xml_diff>
--- a/progettazione/2.Formalizzazione modello.docx
+++ b/progettazione/2.Formalizzazione modello.docx
@@ -23,15 +23,7 @@
     </w:p>
     <w:p>
       <w:r>
-        <w:t xml:space="preserve">Dopo aver analizzato il sistema produttivo a </w:t>
-      </w:r>
-      <w:proofErr w:type="gramStart"/>
-      <w:r>
-        <w:t>5</w:t>
-      </w:r>
-      <w:proofErr w:type="gramEnd"/>
-      <w:r>
-        <w:t xml:space="preserve"> stazioni e identificato le principali entità e dinamiche operative, </w:t>
+        <w:t xml:space="preserve">Dopo aver analizzato il sistema produttivo a 5 stazioni e identificato le principali entità e dinamiche operative, </w:t>
       </w:r>
       <w:r>
         <w:t>procediamo</w:t>
@@ -246,13 +238,8 @@
         </w:numPr>
       </w:pPr>
       <w:r>
-        <w:t xml:space="preserve">sort </w:t>
-      </w:r>
-      <w:proofErr w:type="gramStart"/>
-      <w:r>
-        <w:t>MachineState .</w:t>
-      </w:r>
-      <w:proofErr w:type="gramEnd"/>
+        <w:t>sort MachineState .</w:t>
+      </w:r>
     </w:p>
     <w:p>
       <w:pPr>
@@ -263,13 +250,8 @@
         </w:numPr>
       </w:pPr>
       <w:r>
-        <w:t xml:space="preserve">sort </w:t>
-      </w:r>
-      <w:proofErr w:type="gramStart"/>
-      <w:r>
-        <w:t>Station .</w:t>
-      </w:r>
-      <w:proofErr w:type="gramEnd"/>
+        <w:t>sort Station .</w:t>
+      </w:r>
     </w:p>
     <w:p>
       <w:pPr>
@@ -280,13 +262,8 @@
         </w:numPr>
       </w:pPr>
       <w:r>
-        <w:t xml:space="preserve">sort </w:t>
-      </w:r>
-      <w:proofErr w:type="gramStart"/>
-      <w:r>
-        <w:t>Pallet .</w:t>
-      </w:r>
-      <w:proofErr w:type="gramEnd"/>
+        <w:t>sort Pallet .</w:t>
+      </w:r>
     </w:p>
     <w:p>
       <w:pPr>
@@ -297,13 +274,8 @@
         </w:numPr>
       </w:pPr>
       <w:r>
-        <w:t xml:space="preserve">sort </w:t>
-      </w:r>
-      <w:proofErr w:type="gramStart"/>
-      <w:r>
-        <w:t>Config .</w:t>
-      </w:r>
-      <w:proofErr w:type="gramEnd"/>
+        <w:t>sort Config .</w:t>
+      </w:r>
     </w:p>
     <w:p>
       <w:pPr>
@@ -371,18 +343,8 @@
           <w:sz w:val="22"/>
           <w:szCs w:val="22"/>
         </w:rPr>
-        <w:t xml:space="preserve">sort </w:t>
-      </w:r>
-      <w:proofErr w:type="gramStart"/>
-      <w:r>
-        <w:rPr>
-          <w:rFonts w:asciiTheme="minorHAnsi" w:hAnsiTheme="minorHAnsi"/>
-          <w:sz w:val="22"/>
-          <w:szCs w:val="22"/>
-        </w:rPr>
-        <w:t>StationId .</w:t>
-      </w:r>
-      <w:proofErr w:type="gramEnd"/>
+        <w:t>sort StationId .</w:t>
+      </w:r>
     </w:p>
     <w:p>
       <w:pPr>
@@ -403,18 +365,8 @@
           <w:sz w:val="22"/>
           <w:szCs w:val="22"/>
         </w:rPr>
-        <w:t xml:space="preserve">sort </w:t>
-      </w:r>
-      <w:proofErr w:type="gramStart"/>
-      <w:r>
-        <w:rPr>
-          <w:rFonts w:asciiTheme="minorHAnsi" w:hAnsiTheme="minorHAnsi"/>
-          <w:sz w:val="22"/>
-          <w:szCs w:val="22"/>
-        </w:rPr>
-        <w:t>PalletId .</w:t>
-      </w:r>
-      <w:proofErr w:type="gramEnd"/>
+        <w:t>sort PalletId .</w:t>
+      </w:r>
     </w:p>
     <w:p>
       <w:pPr>
@@ -453,34 +405,24 @@
           <w:sz w:val="22"/>
           <w:szCs w:val="22"/>
         </w:rPr>
-        <w:t xml:space="preserve">sort </w:t>
-      </w:r>
-      <w:proofErr w:type="gramStart"/>
-      <w:r>
+        <w:t>sort PalletList .</w:t>
+      </w:r>
+    </w:p>
+    <w:p>
+      <w:pPr>
+        <w:pStyle w:val="NormaleWeb"/>
         <w:rPr>
           <w:rFonts w:asciiTheme="minorHAnsi" w:hAnsiTheme="minorHAnsi"/>
           <w:sz w:val="22"/>
           <w:szCs w:val="22"/>
         </w:rPr>
-        <w:t>PalletList .</w:t>
-      </w:r>
-      <w:proofErr w:type="gramEnd"/>
-    </w:p>
-    <w:p>
-      <w:pPr>
-        <w:pStyle w:val="NormaleWeb"/>
+      </w:pPr>
+      <w:r>
         <w:rPr>
           <w:rFonts w:asciiTheme="minorHAnsi" w:hAnsiTheme="minorHAnsi"/>
           <w:sz w:val="22"/>
           <w:szCs w:val="22"/>
         </w:rPr>
-      </w:pPr>
-      <w:r>
-        <w:rPr>
-          <w:rFonts w:asciiTheme="minorHAnsi" w:hAnsiTheme="minorHAnsi"/>
-          <w:sz w:val="22"/>
-          <w:szCs w:val="22"/>
-        </w:rPr>
         <w:t>La struttura interna dei buffer sarà una lista di Pallet, in modo da mantenere identificativo, tipo e ricavare la posizione di ogni singolo Pallet e non rappresentarli solamente tramite la quantità presente.</w:t>
       </w:r>
     </w:p>
@@ -510,21 +452,8 @@
     </w:p>
     <w:p>
       <w:r>
-        <w:t xml:space="preserve">ops idle processing blocked </w:t>
-      </w:r>
-      <w:proofErr w:type="gramStart"/>
-      <w:r>
-        <w:t>fail :</w:t>
-      </w:r>
-      <w:proofErr w:type="gramEnd"/>
-      <w:r>
-        <w:t xml:space="preserve"> -&gt; </w:t>
-      </w:r>
-      <w:proofErr w:type="gramStart"/>
-      <w:r>
-        <w:t>MachineState .</w:t>
-      </w:r>
-      <w:proofErr w:type="gramEnd"/>
+        <w:t>ops idle processing blocked fail : -&gt; MachineState .</w:t>
+      </w:r>
     </w:p>
     <w:p>
       <w:r>
@@ -693,29 +622,8 @@
     </w:p>
     <w:p>
       <w:r>
-        <w:t>op &lt;</w:t>
-      </w:r>
-      <w:proofErr w:type="gramStart"/>
-      <w:r>
-        <w:t>_,_</w:t>
-      </w:r>
-      <w:proofErr w:type="gramEnd"/>
-      <w:r>
-        <w:t>,</w:t>
-      </w:r>
-      <w:proofErr w:type="gramStart"/>
-      <w:r>
-        <w:t>_,_</w:t>
-      </w:r>
-      <w:proofErr w:type="gramEnd"/>
-      <w:r>
-        <w:t>,_</w:t>
-      </w:r>
-      <w:proofErr w:type="gramStart"/>
-      <w:r>
-        <w:t>&gt; :</w:t>
-      </w:r>
-      <w:proofErr w:type="gramEnd"/>
+        <w:t>op &lt;_,_,_,_&gt; :</w:t>
+      </w:r>
       <w:r>
         <w:br/>
         <w:t xml:space="preserve">StationId MachineState </w:t>
@@ -757,13 +665,8 @@
         <w:t xml:space="preserve"> </w:t>
       </w:r>
       <w:r>
-        <w:t xml:space="preserve">Nat -&gt; </w:t>
-      </w:r>
-      <w:proofErr w:type="gramStart"/>
-      <w:r>
-        <w:t>Station .</w:t>
-      </w:r>
-      <w:proofErr w:type="gramEnd"/>
+        <w:t>Nat -&gt; Station .</w:t>
+      </w:r>
     </w:p>
     <w:p>
       <w:r>
@@ -830,13 +733,7 @@
         <w:t xml:space="preserve">è </w:t>
       </w:r>
       <w:r>
-        <w:t xml:space="preserve">il buffer di </w:t>
-      </w:r>
-      <w:r>
-        <w:t>uscita</w:t>
-      </w:r>
-      <w:r>
-        <w:t xml:space="preserve"> della stazione</w:t>
+        <w:t>il buffer di uscita della stazione</w:t>
       </w:r>
       <w:r>
         <w:t xml:space="preserve"> </w:t>
@@ -873,10 +770,7 @@
     </w:p>
     <w:p>
       <w:r>
-        <w:t>I buffer delle stazioni sono modellati come liste di pallet, anziché come semplici cardinalità. Questa scelta consente di rappresentare esplicitamente le entità presenti nel sistema e di tracciare il flusso dei singoli pallet tra le stazioni.</w:t>
-      </w:r>
-      <w:r>
-        <w:t xml:space="preserve"> </w:t>
+        <w:t xml:space="preserve">I buffer delle stazioni sono modellati come liste di pallet, anziché come semplici cardinalità. Questa scelta consente di rappresentare esplicitamente le entità presenti nel sistema e di tracciare il flusso dei singoli pallet tra le stazioni. </w:t>
       </w:r>
     </w:p>
     <w:p>
@@ -915,21 +809,8 @@
     </w:p>
     <w:p>
       <w:r>
-        <w:t xml:space="preserve">op </w:t>
-      </w:r>
-      <w:proofErr w:type="gramStart"/>
-      <w:r>
-        <w:t>p(_,_) :</w:t>
-      </w:r>
-      <w:proofErr w:type="gramEnd"/>
-      <w:r>
-        <w:t xml:space="preserve"> PalletId Type -&gt; </w:t>
-      </w:r>
-      <w:proofErr w:type="gramStart"/>
-      <w:r>
-        <w:t>Pallet .</w:t>
-      </w:r>
-      <w:proofErr w:type="gramEnd"/>
+        <w:t>op p(_,_) : PalletId Type -&gt; Pallet .</w:t>
+      </w:r>
     </w:p>
     <w:p>
       <w:r>
@@ -937,13 +818,8 @@
       </w:r>
     </w:p>
     <w:p>
-      <w:proofErr w:type="gramStart"/>
-      <w:r>
-        <w:t>p(</w:t>
-      </w:r>
-      <w:proofErr w:type="gramEnd"/>
-      <w:r>
-        <w:t>id, tipo)</w:t>
+      <w:r>
+        <w:t>p(id, tipo)</w:t>
       </w:r>
     </w:p>
     <w:p>
@@ -1011,22 +887,12 @@
     </w:p>
     <w:p>
       <w:r>
-        <w:t xml:space="preserve">sort </w:t>
-      </w:r>
-      <w:proofErr w:type="gramStart"/>
-      <w:r>
-        <w:t>Config .</w:t>
-      </w:r>
-      <w:proofErr w:type="gramEnd"/>
+        <w:t>sort Config .</w:t>
+      </w:r>
       <w:r>
         <w:br/>
-        <w:t xml:space="preserve">subsort Station Pallet &lt; </w:t>
-      </w:r>
-      <w:proofErr w:type="gramStart"/>
-      <w:r>
-        <w:t>Config .</w:t>
-      </w:r>
-      <w:proofErr w:type="gramEnd"/>
+        <w:t>subsort Station Pallet &lt; Config .</w:t>
+      </w:r>
     </w:p>
     <w:p>
       <w:pPr>
@@ -1061,21 +927,8 @@
     </w:p>
     <w:p>
       <w:r>
-        <w:t xml:space="preserve">op </w:t>
-      </w:r>
-      <w:proofErr w:type="gramStart"/>
-      <w:r>
-        <w:t>next :</w:t>
-      </w:r>
-      <w:proofErr w:type="gramEnd"/>
-      <w:r>
-        <w:t xml:space="preserve"> StationId -&gt; </w:t>
-      </w:r>
-      <w:proofErr w:type="gramStart"/>
-      <w:r>
-        <w:t>StationId .</w:t>
-      </w:r>
-      <w:proofErr w:type="gramEnd"/>
+        <w:t>op next : StationId -&gt; StationId .</w:t>
+      </w:r>
     </w:p>
     <w:p>
       <w:pPr>
@@ -1225,21 +1078,8 @@
     </w:p>
     <w:p>
       <w:r>
-        <w:t xml:space="preserve">op </w:t>
-      </w:r>
-      <w:proofErr w:type="gramStart"/>
-      <w:r>
-        <w:t>buffer(_,_) :</w:t>
-      </w:r>
-      <w:proofErr w:type="gramEnd"/>
-      <w:r>
-        <w:t xml:space="preserve"> PalletList Nat -&gt; </w:t>
-      </w:r>
-      <w:proofErr w:type="gramStart"/>
-      <w:r>
-        <w:t>Buffer .</w:t>
-      </w:r>
-      <w:proofErr w:type="gramEnd"/>
+        <w:t>op buffer(_,_) : PalletList Nat -&gt; Buffer .</w:t>
+      </w:r>
     </w:p>
     <w:p>
       <w:r>
@@ -1271,25 +1111,7 @@
           <w:sz w:val="28"/>
           <w:szCs w:val="28"/>
         </w:rPr>
-        <w:t>.</w:t>
-      </w:r>
-      <w:r>
-        <w:rPr>
-          <w:b/>
-          <w:bCs/>
-          <w:sz w:val="28"/>
-          <w:szCs w:val="28"/>
-        </w:rPr>
-        <w:t xml:space="preserve"> </w:t>
-      </w:r>
-      <w:r>
-        <w:rPr>
-          <w:b/>
-          <w:bCs/>
-          <w:sz w:val="28"/>
-          <w:szCs w:val="28"/>
-        </w:rPr>
-        <w:t>Definizione dello stato iniziale</w:t>
+        <w:t>. Definizione dello stato iniziale</w:t>
       </w:r>
     </w:p>
     <w:p>
@@ -1299,21 +1121,8 @@
     </w:p>
     <w:p>
       <w:r>
-        <w:t xml:space="preserve">op </w:t>
-      </w:r>
-      <w:proofErr w:type="gramStart"/>
-      <w:r>
-        <w:t>init :</w:t>
-      </w:r>
-      <w:proofErr w:type="gramEnd"/>
-      <w:r>
-        <w:t xml:space="preserve"> -&gt; </w:t>
-      </w:r>
-      <w:proofErr w:type="gramStart"/>
-      <w:r>
-        <w:t>Config .</w:t>
-      </w:r>
-      <w:proofErr w:type="gramEnd"/>
+        <w:t>op init : -&gt; Config .</w:t>
+      </w:r>
     </w:p>
     <w:p>
       <w:pPr>
@@ -1340,13 +1149,8 @@
       <w:r>
         <w:t xml:space="preserve">pallet inizialmente in S1 </w:t>
       </w:r>
-      <w:proofErr w:type="gramStart"/>
-      <w:r>
-        <w:t>( possibile</w:t>
-      </w:r>
-      <w:proofErr w:type="gramEnd"/>
-      <w:r>
-        <w:t xml:space="preserve"> revisione)</w:t>
+      <w:r>
+        <w:t>( possibile revisione)</w:t>
       </w:r>
     </w:p>
     <w:p>
@@ -1719,6 +1523,9 @@
         <w:ind w:firstLine="360"/>
       </w:pPr>
       <w:r>
+        <w:rPr>
+          <w:noProof/>
+        </w:rPr>
         <w:drawing>
           <wp:inline distT="0" distB="0" distL="0" distR="0" wp14:anchorId="653E437B" wp14:editId="2FC1475F">
             <wp:extent cx="1927559" cy="504967"/>
@@ -4537,6 +4344,7 @@
   <w:style w:type="character" w:default="1" w:styleId="Carpredefinitoparagrafo">
     <w:name w:val="Default Paragraph Font"/>
     <w:uiPriority w:val="1"/>
+    <w:semiHidden/>
     <w:unhideWhenUsed/>
   </w:style>
   <w:style w:type="table" w:default="1" w:styleId="Tabellanormale">

</xml_diff>